<commit_message>
Deployed a891267 with MkDocs version: 1.6.1
</commit_message>
<xml_diff>
--- a/tema1/plantillas/Actividad_1_2_PSP_Plantilla.docx
+++ b/tema1/plantillas/Actividad_1_2_PSP_Plantilla.docx
@@ -349,7 +349,7 @@
                 <w:sz w:val="20"/>
                 <w:szCs w:val="20"/>
               </w:rPr>
-              <w:t xml:space="preserve">Este documento relleno: la pregunta y la captura del Paso 3, las capturas de las cuatro operaciones de Videojuego (con la predicción del PUT), las capturas de las cuatro operaciones de Estudio, y la respuesta a la pregunta final.</w:t>
+              <w:t xml:space="preserve">Este documento relleno: la captura del Paso 1, la pregunta y la captura del Paso 3, las capturas de Responses y de las cuatro operaciones de Videojuego (con la predicción del PUT), las capturas de Responses y de las cuatro operaciones de Estudio, y la respuesta a la pregunta final.</w:t>
             </w:r>
           </w:p>
         </w:tc>
@@ -380,7 +380,7 @@
           <w:sz w:val="26"/>
           <w:szCs w:val="26"/>
         </w:rPr>
-        <w:t xml:space="preserve">Paso 3 — Recorrer Swagger UI</w:t>
+        <w:t xml:space="preserve">Paso 1 — Añadir springdoc a tu proyecto</w:t>
       </w:r>
     </w:p>
     <w:p>
@@ -404,7 +404,7 @@
           <w:sz w:val="24"/>
           <w:szCs w:val="24"/>
         </w:rPr>
-        <w:t xml:space="preserve">Pregunta</w:t>
+        <w:t xml:space="preserve">Captura</w:t>
       </w:r>
     </w:p>
     <w:tbl>
@@ -423,8 +423,41 @@
         <w:gridCol w:w="9638"/>
       </w:tblGrid>
       <w:tr>
+        <w:tc>
+          <w:tcPr>
+            <w:tcW w:type="dxa" w:w="9638"/>
+            <w:tcBorders>
+              <w:top w:val="none" w:color="FFFFFF" w:sz="0"/>
+              <w:left w:val="none" w:color="FFFFFF" w:sz="0"/>
+              <w:bottom w:val="none" w:color="FFFFFF" w:sz="0"/>
+              <w:right w:val="none" w:color="FFFFFF" w:sz="0"/>
+            </w:tcBorders>
+            <w:shd w:fill="6D4C41" w:val="clear"/>
+            <w:tcMar>
+              <w:top w:type="dxa" w:w="80"/>
+              <w:left w:type="dxa" w:w="160"/>
+              <w:bottom w:type="dxa" w:w="80"/>
+              <w:right w:type="dxa" w:w="160"/>
+            </w:tcMar>
+          </w:tcPr>
+          <w:p>
+            <w:r>
+              <w:rPr>
+                <w:rFonts w:ascii="Arial" w:cs="Arial" w:eastAsia="Arial" w:hAnsi="Arial"/>
+                <w:b/>
+                <w:bCs/>
+                <w:color w:val="FFFFFF"/>
+                <w:sz w:val="20"/>
+                <w:szCs w:val="20"/>
+              </w:rPr>
+              <w:t xml:space="preserve">📸 Swagger UI tras entrar en /documentacion (URL final visible), endpoints en orden DELETE, GET, GET, POST, PUT</w:t>
+            </w:r>
+          </w:p>
+        </w:tc>
+      </w:tr>
+      <w:tr>
         <w:trPr>
-          <w:trHeight w:val="480"/>
+          <w:trHeight w:val="2400"/>
         </w:trPr>
         <w:tc>
           <w:tcPr>
@@ -437,120 +470,64 @@
             </w:tcBorders>
             <w:shd w:fill="FAFAFA" w:val="clear"/>
             <w:tcMar>
-              <w:top w:type="dxa" w:w="60"/>
-              <w:left w:type="dxa" w:w="160"/>
-              <w:bottom w:type="dxa" w:w="60"/>
-              <w:right w:type="dxa" w:w="160"/>
-            </w:tcMar>
-          </w:tcPr>
-          <w:p>
-            <w:r>
-              <w:rPr>
-                <w:sz w:val="22"/>
-                <w:szCs w:val="22"/>
-              </w:rPr>
-              <w:t xml:space="preserve"/>
-            </w:r>
-          </w:p>
-        </w:tc>
-      </w:tr>
-      <w:tr>
-        <w:trPr>
-          <w:trHeight w:val="480"/>
-        </w:trPr>
-        <w:tc>
-          <w:tcPr>
-            <w:tcW w:type="dxa" w:w="9638"/>
-            <w:tcBorders>
-              <w:top w:val="single" w:color="E0E0E0" w:sz="4"/>
-              <w:left w:val="single" w:color="E0E0E0" w:sz="4"/>
-              <w:bottom w:val="single" w:color="E0E0E0" w:sz="4"/>
-              <w:right w:val="single" w:color="E0E0E0" w:sz="4"/>
-            </w:tcBorders>
-            <w:shd w:fill="FAFAFA" w:val="clear"/>
-            <w:tcMar>
-              <w:top w:type="dxa" w:w="60"/>
-              <w:left w:type="dxa" w:w="160"/>
-              <w:bottom w:type="dxa" w:w="60"/>
-              <w:right w:type="dxa" w:w="160"/>
-            </w:tcMar>
-          </w:tcPr>
-          <w:p>
-            <w:r>
-              <w:rPr>
-                <w:sz w:val="22"/>
-                <w:szCs w:val="22"/>
-              </w:rPr>
-              <w:t xml:space="preserve"/>
-            </w:r>
-          </w:p>
-        </w:tc>
-      </w:tr>
-      <w:tr>
-        <w:trPr>
-          <w:trHeight w:val="480"/>
-        </w:trPr>
-        <w:tc>
-          <w:tcPr>
-            <w:tcW w:type="dxa" w:w="9638"/>
-            <w:tcBorders>
-              <w:top w:val="single" w:color="E0E0E0" w:sz="4"/>
-              <w:left w:val="single" w:color="E0E0E0" w:sz="4"/>
-              <w:bottom w:val="single" w:color="E0E0E0" w:sz="4"/>
-              <w:right w:val="single" w:color="E0E0E0" w:sz="4"/>
-            </w:tcBorders>
-            <w:shd w:fill="FAFAFA" w:val="clear"/>
-            <w:tcMar>
-              <w:top w:type="dxa" w:w="60"/>
-              <w:left w:type="dxa" w:w="160"/>
-              <w:bottom w:type="dxa" w:w="60"/>
-              <w:right w:type="dxa" w:w="160"/>
-            </w:tcMar>
-          </w:tcPr>
-          <w:p>
-            <w:r>
-              <w:rPr>
-                <w:sz w:val="22"/>
-                <w:szCs w:val="22"/>
-              </w:rPr>
-              <w:t xml:space="preserve"/>
-            </w:r>
-          </w:p>
-        </w:tc>
-      </w:tr>
-      <w:tr>
-        <w:trPr>
-          <w:trHeight w:val="480"/>
-        </w:trPr>
-        <w:tc>
-          <w:tcPr>
-            <w:tcW w:type="dxa" w:w="9638"/>
-            <w:tcBorders>
-              <w:top w:val="single" w:color="E0E0E0" w:sz="4"/>
-              <w:left w:val="single" w:color="E0E0E0" w:sz="4"/>
-              <w:bottom w:val="single" w:color="E0E0E0" w:sz="4"/>
-              <w:right w:val="single" w:color="E0E0E0" w:sz="4"/>
-            </w:tcBorders>
-            <w:shd w:fill="FAFAFA" w:val="clear"/>
-            <w:tcMar>
-              <w:top w:type="dxa" w:w="60"/>
-              <w:left w:type="dxa" w:w="160"/>
-              <w:bottom w:type="dxa" w:w="60"/>
-              <w:right w:type="dxa" w:w="160"/>
-            </w:tcMar>
-          </w:tcPr>
-          <w:p>
-            <w:r>
-              <w:rPr>
-                <w:sz w:val="22"/>
-                <w:szCs w:val="22"/>
-              </w:rPr>
-              <w:t xml:space="preserve"/>
+              <w:top w:type="dxa" w:w="80"/>
+              <w:left w:type="dxa" w:w="160"/>
+              <w:bottom w:type="dxa" w:w="80"/>
+              <w:right w:type="dxa" w:w="160"/>
+            </w:tcMar>
+          </w:tcPr>
+          <w:p>
+            <w:pPr>
+              <w:jc w:val="center"/>
+            </w:pPr>
+            <w:r>
+              <w:rPr>
+                <w:rFonts w:ascii="Arial" w:cs="Arial" w:eastAsia="Arial" w:hAnsi="Arial"/>
+                <w:i/>
+                <w:iCs/>
+                <w:color w:val="757575"/>
+                <w:sz w:val="20"/>
+                <w:szCs w:val="20"/>
+              </w:rPr>
+              <w:t xml:space="preserve">[Pega aquí la captura de pantalla]</w:t>
             </w:r>
           </w:p>
         </w:tc>
       </w:tr>
     </w:tbl>
+    <w:p>
+      <w:pPr>
+        <w:spacing w:after="200"/>
+      </w:pPr>
+    </w:p>
+    <w:p>
+      <w:r>
+        <w:br w:type="page"/>
+      </w:r>
+    </w:p>
+    <w:p>
+      <w:pPr>
+        <w:shd w:fill="6D4C41" w:val="clear"/>
+        <w:spacing w:after="0" w:before="320"/>
+        <w:ind w:left="200" w:right="200"/>
+      </w:pPr>
+      <w:r>
+        <w:rPr>
+          <w:rFonts w:ascii="Arial" w:cs="Arial" w:eastAsia="Arial" w:hAnsi="Arial"/>
+          <w:b/>
+          <w:bCs/>
+          <w:color w:val="FFFFFF"/>
+          <w:sz w:val="26"/>
+          <w:szCs w:val="26"/>
+        </w:rPr>
+        <w:t xml:space="preserve">Paso 3 — Recorrer Swagger UI</w:t>
+      </w:r>
+    </w:p>
+    <w:p>
+      <w:pPr>
+        <w:spacing w:after="80"/>
+      </w:pPr>
+    </w:p>
     <w:p>
       <w:pPr>
         <w:pBdr>
@@ -567,7 +544,7 @@
           <w:sz w:val="24"/>
           <w:szCs w:val="24"/>
         </w:rPr>
-        <w:t xml:space="preserve">Captura — Schemas</w:t>
+        <w:t xml:space="preserve">Pregunta</w:t>
       </w:r>
     </w:p>
     <w:tbl>
@@ -586,41 +563,8 @@
         <w:gridCol w:w="9638"/>
       </w:tblGrid>
       <w:tr>
-        <w:tc>
-          <w:tcPr>
-            <w:tcW w:type="dxa" w:w="9638"/>
-            <w:tcBorders>
-              <w:top w:val="none" w:color="FFFFFF" w:sz="0"/>
-              <w:left w:val="none" w:color="FFFFFF" w:sz="0"/>
-              <w:bottom w:val="none" w:color="FFFFFF" w:sz="0"/>
-              <w:right w:val="none" w:color="FFFFFF" w:sz="0"/>
-            </w:tcBorders>
-            <w:shd w:fill="6D4C41" w:val="clear"/>
-            <w:tcMar>
-              <w:top w:type="dxa" w:w="80"/>
-              <w:left w:type="dxa" w:w="160"/>
-              <w:bottom w:type="dxa" w:w="80"/>
-              <w:right w:type="dxa" w:w="160"/>
-            </w:tcMar>
-          </w:tcPr>
-          <w:p>
-            <w:r>
-              <w:rPr>
-                <w:rFonts w:ascii="Arial" w:cs="Arial" w:eastAsia="Arial" w:hAnsi="Arial"/>
-                <w:b/>
-                <w:bCs/>
-                <w:color w:val="FFFFFF"/>
-                <w:sz w:val="20"/>
-                <w:szCs w:val="20"/>
-              </w:rPr>
-              <w:t xml:space="preserve">📸 VideojuegoCreateDTO o VideojuegoResponseDTO desplegado en la sección Schemas</w:t>
-            </w:r>
-          </w:p>
-        </w:tc>
-      </w:tr>
-      <w:tr>
         <w:trPr>
-          <w:trHeight w:val="2400"/>
+          <w:trHeight w:val="480"/>
         </w:trPr>
         <w:tc>
           <w:tcPr>
@@ -633,64 +577,120 @@
             </w:tcBorders>
             <w:shd w:fill="FAFAFA" w:val="clear"/>
             <w:tcMar>
-              <w:top w:type="dxa" w:w="80"/>
-              <w:left w:type="dxa" w:w="160"/>
-              <w:bottom w:type="dxa" w:w="80"/>
-              <w:right w:type="dxa" w:w="160"/>
-            </w:tcMar>
-          </w:tcPr>
-          <w:p>
-            <w:pPr>
-              <w:jc w:val="center"/>
-            </w:pPr>
-            <w:r>
-              <w:rPr>
-                <w:rFonts w:ascii="Arial" w:cs="Arial" w:eastAsia="Arial" w:hAnsi="Arial"/>
-                <w:i/>
-                <w:iCs/>
-                <w:color w:val="757575"/>
-                <w:sz w:val="20"/>
-                <w:szCs w:val="20"/>
-              </w:rPr>
-              <w:t xml:space="preserve">[Pega aquí la captura de pantalla]</w:t>
+              <w:top w:type="dxa" w:w="60"/>
+              <w:left w:type="dxa" w:w="160"/>
+              <w:bottom w:type="dxa" w:w="60"/>
+              <w:right w:type="dxa" w:w="160"/>
+            </w:tcMar>
+          </w:tcPr>
+          <w:p>
+            <w:r>
+              <w:rPr>
+                <w:sz w:val="22"/>
+                <w:szCs w:val="22"/>
+              </w:rPr>
+              <w:t xml:space="preserve"/>
+            </w:r>
+          </w:p>
+        </w:tc>
+      </w:tr>
+      <w:tr>
+        <w:trPr>
+          <w:trHeight w:val="480"/>
+        </w:trPr>
+        <w:tc>
+          <w:tcPr>
+            <w:tcW w:type="dxa" w:w="9638"/>
+            <w:tcBorders>
+              <w:top w:val="single" w:color="E0E0E0" w:sz="4"/>
+              <w:left w:val="single" w:color="E0E0E0" w:sz="4"/>
+              <w:bottom w:val="single" w:color="E0E0E0" w:sz="4"/>
+              <w:right w:val="single" w:color="E0E0E0" w:sz="4"/>
+            </w:tcBorders>
+            <w:shd w:fill="FAFAFA" w:val="clear"/>
+            <w:tcMar>
+              <w:top w:type="dxa" w:w="60"/>
+              <w:left w:type="dxa" w:w="160"/>
+              <w:bottom w:type="dxa" w:w="60"/>
+              <w:right w:type="dxa" w:w="160"/>
+            </w:tcMar>
+          </w:tcPr>
+          <w:p>
+            <w:r>
+              <w:rPr>
+                <w:sz w:val="22"/>
+                <w:szCs w:val="22"/>
+              </w:rPr>
+              <w:t xml:space="preserve"/>
+            </w:r>
+          </w:p>
+        </w:tc>
+      </w:tr>
+      <w:tr>
+        <w:trPr>
+          <w:trHeight w:val="480"/>
+        </w:trPr>
+        <w:tc>
+          <w:tcPr>
+            <w:tcW w:type="dxa" w:w="9638"/>
+            <w:tcBorders>
+              <w:top w:val="single" w:color="E0E0E0" w:sz="4"/>
+              <w:left w:val="single" w:color="E0E0E0" w:sz="4"/>
+              <w:bottom w:val="single" w:color="E0E0E0" w:sz="4"/>
+              <w:right w:val="single" w:color="E0E0E0" w:sz="4"/>
+            </w:tcBorders>
+            <w:shd w:fill="FAFAFA" w:val="clear"/>
+            <w:tcMar>
+              <w:top w:type="dxa" w:w="60"/>
+              <w:left w:type="dxa" w:w="160"/>
+              <w:bottom w:type="dxa" w:w="60"/>
+              <w:right w:type="dxa" w:w="160"/>
+            </w:tcMar>
+          </w:tcPr>
+          <w:p>
+            <w:r>
+              <w:rPr>
+                <w:sz w:val="22"/>
+                <w:szCs w:val="22"/>
+              </w:rPr>
+              <w:t xml:space="preserve"/>
+            </w:r>
+          </w:p>
+        </w:tc>
+      </w:tr>
+      <w:tr>
+        <w:trPr>
+          <w:trHeight w:val="480"/>
+        </w:trPr>
+        <w:tc>
+          <w:tcPr>
+            <w:tcW w:type="dxa" w:w="9638"/>
+            <w:tcBorders>
+              <w:top w:val="single" w:color="E0E0E0" w:sz="4"/>
+              <w:left w:val="single" w:color="E0E0E0" w:sz="4"/>
+              <w:bottom w:val="single" w:color="E0E0E0" w:sz="4"/>
+              <w:right w:val="single" w:color="E0E0E0" w:sz="4"/>
+            </w:tcBorders>
+            <w:shd w:fill="FAFAFA" w:val="clear"/>
+            <w:tcMar>
+              <w:top w:type="dxa" w:w="60"/>
+              <w:left w:type="dxa" w:w="160"/>
+              <w:bottom w:type="dxa" w:w="60"/>
+              <w:right w:type="dxa" w:w="160"/>
+            </w:tcMar>
+          </w:tcPr>
+          <w:p>
+            <w:r>
+              <w:rPr>
+                <w:sz w:val="22"/>
+                <w:szCs w:val="22"/>
+              </w:rPr>
+              <w:t xml:space="preserve"/>
             </w:r>
           </w:p>
         </w:tc>
       </w:tr>
     </w:tbl>
-    <w:p>
-      <w:pPr>
-        <w:spacing w:after="200"/>
-      </w:pPr>
-    </w:p>
-    <w:p>
-      <w:r>
-        <w:br w:type="page"/>
-      </w:r>
-    </w:p>
-    <w:p>
-      <w:pPr>
-        <w:shd w:fill="6D4C41" w:val="clear"/>
-        <w:spacing w:after="0" w:before="320"/>
-        <w:ind w:left="200" w:right="200"/>
-      </w:pPr>
-      <w:r>
-        <w:rPr>
-          <w:rFonts w:ascii="Arial" w:cs="Arial" w:eastAsia="Arial" w:hAnsi="Arial"/>
-          <w:b/>
-          <w:bCs/>
-          <w:color w:val="FFFFFF"/>
-          <w:sz w:val="26"/>
-          <w:szCs w:val="26"/>
-        </w:rPr>
-        <w:t xml:space="preserve">Bloque A — Videojuego</w:t>
-      </w:r>
-    </w:p>
-    <w:p>
-      <w:pPr>
-        <w:spacing w:after="80"/>
-      </w:pPr>
-    </w:p>
     <w:p>
       <w:pPr>
         <w:pBdr>
@@ -707,7 +707,7 @@
           <w:sz w:val="24"/>
           <w:szCs w:val="24"/>
         </w:rPr>
-        <w:t xml:space="preserve">Captura — GET</w:t>
+        <w:t xml:space="preserve">Captura — Schemas</w:t>
       </w:r>
     </w:p>
     <w:tbl>
@@ -753,7 +753,7 @@
                 <w:sz w:val="20"/>
                 <w:szCs w:val="20"/>
               </w:rPr>
-              <w:t xml:space="preserve">📸 Respuesta de GET /api/v1/videojuegos/{id}</w:t>
+              <w:t xml:space="preserve">📸 VideojuegoCreateDTO o VideojuegoResponseDTO desplegado en la sección Schemas</w:t>
             </w:r>
           </w:p>
         </w:tc>
@@ -800,7 +800,35 @@
     </w:tbl>
     <w:p>
       <w:pPr>
-        <w:spacing w:after="160"/>
+        <w:spacing w:after="200"/>
+      </w:pPr>
+    </w:p>
+    <w:p>
+      <w:r>
+        <w:br w:type="page"/>
+      </w:r>
+    </w:p>
+    <w:p>
+      <w:pPr>
+        <w:shd w:fill="6D4C41" w:val="clear"/>
+        <w:spacing w:after="0" w:before="320"/>
+        <w:ind w:left="200" w:right="200"/>
+      </w:pPr>
+      <w:r>
+        <w:rPr>
+          <w:rFonts w:ascii="Arial" w:cs="Arial" w:eastAsia="Arial" w:hAnsi="Arial"/>
+          <w:b/>
+          <w:bCs/>
+          <w:color w:val="FFFFFF"/>
+          <w:sz w:val="26"/>
+          <w:szCs w:val="26"/>
+        </w:rPr>
+        <w:t xml:space="preserve">Bloque A — Videojuego</w:t>
+      </w:r>
+    </w:p>
+    <w:p>
+      <w:pPr>
+        <w:spacing w:after="80"/>
       </w:pPr>
     </w:p>
     <w:p>
@@ -819,7 +847,7 @@
           <w:sz w:val="24"/>
           <w:szCs w:val="24"/>
         </w:rPr>
-        <w:t xml:space="preserve">Captura — POST</w:t>
+        <w:t xml:space="preserve">Captura — Responses de POST</w:t>
       </w:r>
     </w:p>
     <w:tbl>
@@ -865,7 +893,7 @@
                 <w:sz w:val="20"/>
                 <w:szCs w:val="20"/>
               </w:rPr>
-              <w:t xml:space="preserve">📸 Petición y respuesta del POST /api/v1/videojuegos</w:t>
+              <w:t xml:space="preserve">📸 Sección Responses de POST /api/v1/videojuegos desplegada (sin ejecutar), con los códigos 201/400/404</w:t>
             </w:r>
           </w:p>
         </w:tc>
@@ -931,7 +959,7 @@
           <w:sz w:val="24"/>
           <w:szCs w:val="24"/>
         </w:rPr>
-        <w:t xml:space="preserve">Predicción — antes del PUT</w:t>
+        <w:t xml:space="preserve">Captura — GET</w:t>
       </w:r>
     </w:p>
     <w:tbl>
@@ -950,8 +978,41 @@
         <w:gridCol w:w="9638"/>
       </w:tblGrid>
       <w:tr>
+        <w:tc>
+          <w:tcPr>
+            <w:tcW w:type="dxa" w:w="9638"/>
+            <w:tcBorders>
+              <w:top w:val="none" w:color="FFFFFF" w:sz="0"/>
+              <w:left w:val="none" w:color="FFFFFF" w:sz="0"/>
+              <w:bottom w:val="none" w:color="FFFFFF" w:sz="0"/>
+              <w:right w:val="none" w:color="FFFFFF" w:sz="0"/>
+            </w:tcBorders>
+            <w:shd w:fill="6D4C41" w:val="clear"/>
+            <w:tcMar>
+              <w:top w:type="dxa" w:w="80"/>
+              <w:left w:type="dxa" w:w="160"/>
+              <w:bottom w:type="dxa" w:w="80"/>
+              <w:right w:type="dxa" w:w="160"/>
+            </w:tcMar>
+          </w:tcPr>
+          <w:p>
+            <w:r>
+              <w:rPr>
+                <w:rFonts w:ascii="Arial" w:cs="Arial" w:eastAsia="Arial" w:hAnsi="Arial"/>
+                <w:b/>
+                <w:bCs/>
+                <w:color w:val="FFFFFF"/>
+                <w:sz w:val="20"/>
+                <w:szCs w:val="20"/>
+              </w:rPr>
+              <w:t xml:space="preserve">📸 Respuesta de GET /api/v1/videojuegos/{id}</w:t>
+            </w:r>
+          </w:p>
+        </w:tc>
+      </w:tr>
+      <w:tr>
         <w:trPr>
-          <w:trHeight w:val="480"/>
+          <w:trHeight w:val="2400"/>
         </w:trPr>
         <w:tc>
           <w:tcPr>
@@ -964,56 +1025,36 @@
             </w:tcBorders>
             <w:shd w:fill="FAFAFA" w:val="clear"/>
             <w:tcMar>
-              <w:top w:type="dxa" w:w="60"/>
-              <w:left w:type="dxa" w:w="160"/>
-              <w:bottom w:type="dxa" w:w="60"/>
-              <w:right w:type="dxa" w:w="160"/>
-            </w:tcMar>
-          </w:tcPr>
-          <w:p>
-            <w:r>
-              <w:rPr>
-                <w:sz w:val="22"/>
-                <w:szCs w:val="22"/>
-              </w:rPr>
-              <w:t xml:space="preserve"/>
-            </w:r>
-          </w:p>
-        </w:tc>
-      </w:tr>
-      <w:tr>
-        <w:trPr>
-          <w:trHeight w:val="480"/>
-        </w:trPr>
-        <w:tc>
-          <w:tcPr>
-            <w:tcW w:type="dxa" w:w="9638"/>
-            <w:tcBorders>
-              <w:top w:val="single" w:color="E0E0E0" w:sz="4"/>
-              <w:left w:val="single" w:color="E0E0E0" w:sz="4"/>
-              <w:bottom w:val="single" w:color="E0E0E0" w:sz="4"/>
-              <w:right w:val="single" w:color="E0E0E0" w:sz="4"/>
-            </w:tcBorders>
-            <w:shd w:fill="FAFAFA" w:val="clear"/>
-            <w:tcMar>
-              <w:top w:type="dxa" w:w="60"/>
-              <w:left w:type="dxa" w:w="160"/>
-              <w:bottom w:type="dxa" w:w="60"/>
-              <w:right w:type="dxa" w:w="160"/>
-            </w:tcMar>
-          </w:tcPr>
-          <w:p>
-            <w:r>
-              <w:rPr>
-                <w:sz w:val="22"/>
-                <w:szCs w:val="22"/>
-              </w:rPr>
-              <w:t xml:space="preserve"/>
+              <w:top w:type="dxa" w:w="80"/>
+              <w:left w:type="dxa" w:w="160"/>
+              <w:bottom w:type="dxa" w:w="80"/>
+              <w:right w:type="dxa" w:w="160"/>
+            </w:tcMar>
+          </w:tcPr>
+          <w:p>
+            <w:pPr>
+              <w:jc w:val="center"/>
+            </w:pPr>
+            <w:r>
+              <w:rPr>
+                <w:rFonts w:ascii="Arial" w:cs="Arial" w:eastAsia="Arial" w:hAnsi="Arial"/>
+                <w:i/>
+                <w:iCs/>
+                <w:color w:val="757575"/>
+                <w:sz w:val="20"/>
+                <w:szCs w:val="20"/>
+              </w:rPr>
+              <w:t xml:space="preserve">[Pega aquí la captura de pantalla]</w:t>
             </w:r>
           </w:p>
         </w:tc>
       </w:tr>
     </w:tbl>
+    <w:p>
+      <w:pPr>
+        <w:spacing w:after="160"/>
+      </w:pPr>
+    </w:p>
     <w:p>
       <w:pPr>
         <w:pBdr>
@@ -1030,7 +1071,7 @@
           <w:sz w:val="24"/>
           <w:szCs w:val="24"/>
         </w:rPr>
-        <w:t xml:space="preserve">Captura — PUT</w:t>
+        <w:t xml:space="preserve">Captura — POST</w:t>
       </w:r>
     </w:p>
     <w:tbl>
@@ -1076,7 +1117,7 @@
                 <w:sz w:val="20"/>
                 <w:szCs w:val="20"/>
               </w:rPr>
-              <w:t xml:space="preserve">📸 Petición y respuesta del PUT /api/v1/videojuegos/{id}</w:t>
+              <w:t xml:space="preserve">📸 Petición y respuesta del POST /api/v1/videojuegos</w:t>
             </w:r>
           </w:p>
         </w:tc>
@@ -1142,7 +1183,7 @@
           <w:sz w:val="24"/>
           <w:szCs w:val="24"/>
         </w:rPr>
-        <w:t xml:space="preserve">Captura — DELETE y GET posterior</w:t>
+        <w:t xml:space="preserve">Predicción — antes del PUT</w:t>
       </w:r>
     </w:p>
     <w:tbl>
@@ -1161,6 +1202,217 @@
         <w:gridCol w:w="9638"/>
       </w:tblGrid>
       <w:tr>
+        <w:trPr>
+          <w:trHeight w:val="480"/>
+        </w:trPr>
+        <w:tc>
+          <w:tcPr>
+            <w:tcW w:type="dxa" w:w="9638"/>
+            <w:tcBorders>
+              <w:top w:val="single" w:color="E0E0E0" w:sz="4"/>
+              <w:left w:val="single" w:color="E0E0E0" w:sz="4"/>
+              <w:bottom w:val="single" w:color="E0E0E0" w:sz="4"/>
+              <w:right w:val="single" w:color="E0E0E0" w:sz="4"/>
+            </w:tcBorders>
+            <w:shd w:fill="FAFAFA" w:val="clear"/>
+            <w:tcMar>
+              <w:top w:type="dxa" w:w="60"/>
+              <w:left w:type="dxa" w:w="160"/>
+              <w:bottom w:type="dxa" w:w="60"/>
+              <w:right w:type="dxa" w:w="160"/>
+            </w:tcMar>
+          </w:tcPr>
+          <w:p>
+            <w:r>
+              <w:rPr>
+                <w:sz w:val="22"/>
+                <w:szCs w:val="22"/>
+              </w:rPr>
+              <w:t xml:space="preserve"/>
+            </w:r>
+          </w:p>
+        </w:tc>
+      </w:tr>
+      <w:tr>
+        <w:trPr>
+          <w:trHeight w:val="480"/>
+        </w:trPr>
+        <w:tc>
+          <w:tcPr>
+            <w:tcW w:type="dxa" w:w="9638"/>
+            <w:tcBorders>
+              <w:top w:val="single" w:color="E0E0E0" w:sz="4"/>
+              <w:left w:val="single" w:color="E0E0E0" w:sz="4"/>
+              <w:bottom w:val="single" w:color="E0E0E0" w:sz="4"/>
+              <w:right w:val="single" w:color="E0E0E0" w:sz="4"/>
+            </w:tcBorders>
+            <w:shd w:fill="FAFAFA" w:val="clear"/>
+            <w:tcMar>
+              <w:top w:type="dxa" w:w="60"/>
+              <w:left w:type="dxa" w:w="160"/>
+              <w:bottom w:type="dxa" w:w="60"/>
+              <w:right w:type="dxa" w:w="160"/>
+            </w:tcMar>
+          </w:tcPr>
+          <w:p>
+            <w:r>
+              <w:rPr>
+                <w:sz w:val="22"/>
+                <w:szCs w:val="22"/>
+              </w:rPr>
+              <w:t xml:space="preserve"/>
+            </w:r>
+          </w:p>
+        </w:tc>
+      </w:tr>
+    </w:tbl>
+    <w:p>
+      <w:pPr>
+        <w:pBdr>
+          <w:bottom w:val="single" w:color="FFA000" w:sz="4" w:space="1"/>
+        </w:pBdr>
+        <w:spacing w:after="120" w:before="240"/>
+      </w:pPr>
+      <w:r>
+        <w:rPr>
+          <w:rFonts w:ascii="Arial" w:cs="Arial" w:eastAsia="Arial" w:hAnsi="Arial"/>
+          <w:b/>
+          <w:bCs/>
+          <w:color w:val="6D4C41"/>
+          <w:sz w:val="24"/>
+          <w:szCs w:val="24"/>
+        </w:rPr>
+        <w:t xml:space="preserve">Captura — PUT</w:t>
+      </w:r>
+    </w:p>
+    <w:tbl>
+      <w:tblPr>
+        <w:tblW w:type="dxa" w:w="9638"/>
+        <w:tblBorders>
+          <w:top w:val="single" w:color="auto" w:sz="4"/>
+          <w:left w:val="single" w:color="auto" w:sz="4"/>
+          <w:bottom w:val="single" w:color="auto" w:sz="4"/>
+          <w:right w:val="single" w:color="auto" w:sz="4"/>
+          <w:insideH w:val="single" w:color="auto" w:sz="4"/>
+          <w:insideV w:val="single" w:color="auto" w:sz="4"/>
+        </w:tblBorders>
+      </w:tblPr>
+      <w:tblGrid>
+        <w:gridCol w:w="9638"/>
+      </w:tblGrid>
+      <w:tr>
+        <w:tc>
+          <w:tcPr>
+            <w:tcW w:type="dxa" w:w="9638"/>
+            <w:tcBorders>
+              <w:top w:val="none" w:color="FFFFFF" w:sz="0"/>
+              <w:left w:val="none" w:color="FFFFFF" w:sz="0"/>
+              <w:bottom w:val="none" w:color="FFFFFF" w:sz="0"/>
+              <w:right w:val="none" w:color="FFFFFF" w:sz="0"/>
+            </w:tcBorders>
+            <w:shd w:fill="6D4C41" w:val="clear"/>
+            <w:tcMar>
+              <w:top w:type="dxa" w:w="80"/>
+              <w:left w:type="dxa" w:w="160"/>
+              <w:bottom w:type="dxa" w:w="80"/>
+              <w:right w:type="dxa" w:w="160"/>
+            </w:tcMar>
+          </w:tcPr>
+          <w:p>
+            <w:r>
+              <w:rPr>
+                <w:rFonts w:ascii="Arial" w:cs="Arial" w:eastAsia="Arial" w:hAnsi="Arial"/>
+                <w:b/>
+                <w:bCs/>
+                <w:color w:val="FFFFFF"/>
+                <w:sz w:val="20"/>
+                <w:szCs w:val="20"/>
+              </w:rPr>
+              <w:t xml:space="preserve">📸 Petición y respuesta del PUT /api/v1/videojuegos/{id}</w:t>
+            </w:r>
+          </w:p>
+        </w:tc>
+      </w:tr>
+      <w:tr>
+        <w:trPr>
+          <w:trHeight w:val="2400"/>
+        </w:trPr>
+        <w:tc>
+          <w:tcPr>
+            <w:tcW w:type="dxa" w:w="9638"/>
+            <w:tcBorders>
+              <w:top w:val="single" w:color="E0E0E0" w:sz="4"/>
+              <w:left w:val="single" w:color="E0E0E0" w:sz="4"/>
+              <w:bottom w:val="single" w:color="E0E0E0" w:sz="4"/>
+              <w:right w:val="single" w:color="E0E0E0" w:sz="4"/>
+            </w:tcBorders>
+            <w:shd w:fill="FAFAFA" w:val="clear"/>
+            <w:tcMar>
+              <w:top w:type="dxa" w:w="80"/>
+              <w:left w:type="dxa" w:w="160"/>
+              <w:bottom w:type="dxa" w:w="80"/>
+              <w:right w:type="dxa" w:w="160"/>
+            </w:tcMar>
+          </w:tcPr>
+          <w:p>
+            <w:pPr>
+              <w:jc w:val="center"/>
+            </w:pPr>
+            <w:r>
+              <w:rPr>
+                <w:rFonts w:ascii="Arial" w:cs="Arial" w:eastAsia="Arial" w:hAnsi="Arial"/>
+                <w:i/>
+                <w:iCs/>
+                <w:color w:val="757575"/>
+                <w:sz w:val="20"/>
+                <w:szCs w:val="20"/>
+              </w:rPr>
+              <w:t xml:space="preserve">[Pega aquí la captura de pantalla]</w:t>
+            </w:r>
+          </w:p>
+        </w:tc>
+      </w:tr>
+    </w:tbl>
+    <w:p>
+      <w:pPr>
+        <w:spacing w:after="160"/>
+      </w:pPr>
+    </w:p>
+    <w:p>
+      <w:pPr>
+        <w:pBdr>
+          <w:bottom w:val="single" w:color="FFA000" w:sz="4" w:space="1"/>
+        </w:pBdr>
+        <w:spacing w:after="120" w:before="240"/>
+      </w:pPr>
+      <w:r>
+        <w:rPr>
+          <w:rFonts w:ascii="Arial" w:cs="Arial" w:eastAsia="Arial" w:hAnsi="Arial"/>
+          <w:b/>
+          <w:bCs/>
+          <w:color w:val="6D4C41"/>
+          <w:sz w:val="24"/>
+          <w:szCs w:val="24"/>
+        </w:rPr>
+        <w:t xml:space="preserve">Captura — DELETE y GET posterior</w:t>
+      </w:r>
+    </w:p>
+    <w:tbl>
+      <w:tblPr>
+        <w:tblW w:type="dxa" w:w="9638"/>
+        <w:tblBorders>
+          <w:top w:val="single" w:color="auto" w:sz="4"/>
+          <w:left w:val="single" w:color="auto" w:sz="4"/>
+          <w:bottom w:val="single" w:color="auto" w:sz="4"/>
+          <w:right w:val="single" w:color="auto" w:sz="4"/>
+          <w:insideH w:val="single" w:color="auto" w:sz="4"/>
+          <w:insideV w:val="single" w:color="auto" w:sz="4"/>
+        </w:tblBorders>
+      </w:tblPr>
+      <w:tblGrid>
+        <w:gridCol w:w="9638"/>
+      </w:tblGrid>
+      <w:tr>
         <w:tc>
           <w:tcPr>
             <w:tcW w:type="dxa" w:w="9638"/>
@@ -1264,6 +1516,118 @@
     <w:p>
       <w:pPr>
         <w:spacing w:after="80"/>
+      </w:pPr>
+    </w:p>
+    <w:p>
+      <w:pPr>
+        <w:pBdr>
+          <w:bottom w:val="single" w:color="FFA000" w:sz="4" w:space="1"/>
+        </w:pBdr>
+        <w:spacing w:after="120" w:before="240"/>
+      </w:pPr>
+      <w:r>
+        <w:rPr>
+          <w:rFonts w:ascii="Arial" w:cs="Arial" w:eastAsia="Arial" w:hAnsi="Arial"/>
+          <w:b/>
+          <w:bCs/>
+          <w:color w:val="6D4C41"/>
+          <w:sz w:val="24"/>
+          <w:szCs w:val="24"/>
+        </w:rPr>
+        <w:t xml:space="preserve">Captura — Responses de POST</w:t>
+      </w:r>
+    </w:p>
+    <w:tbl>
+      <w:tblPr>
+        <w:tblW w:type="dxa" w:w="9638"/>
+        <w:tblBorders>
+          <w:top w:val="single" w:color="auto" w:sz="4"/>
+          <w:left w:val="single" w:color="auto" w:sz="4"/>
+          <w:bottom w:val="single" w:color="auto" w:sz="4"/>
+          <w:right w:val="single" w:color="auto" w:sz="4"/>
+          <w:insideH w:val="single" w:color="auto" w:sz="4"/>
+          <w:insideV w:val="single" w:color="auto" w:sz="4"/>
+        </w:tblBorders>
+      </w:tblPr>
+      <w:tblGrid>
+        <w:gridCol w:w="9638"/>
+      </w:tblGrid>
+      <w:tr>
+        <w:tc>
+          <w:tcPr>
+            <w:tcW w:type="dxa" w:w="9638"/>
+            <w:tcBorders>
+              <w:top w:val="none" w:color="FFFFFF" w:sz="0"/>
+              <w:left w:val="none" w:color="FFFFFF" w:sz="0"/>
+              <w:bottom w:val="none" w:color="FFFFFF" w:sz="0"/>
+              <w:right w:val="none" w:color="FFFFFF" w:sz="0"/>
+            </w:tcBorders>
+            <w:shd w:fill="6D4C41" w:val="clear"/>
+            <w:tcMar>
+              <w:top w:type="dxa" w:w="80"/>
+              <w:left w:type="dxa" w:w="160"/>
+              <w:bottom w:type="dxa" w:w="80"/>
+              <w:right w:type="dxa" w:w="160"/>
+            </w:tcMar>
+          </w:tcPr>
+          <w:p>
+            <w:r>
+              <w:rPr>
+                <w:rFonts w:ascii="Arial" w:cs="Arial" w:eastAsia="Arial" w:hAnsi="Arial"/>
+                <w:b/>
+                <w:bCs/>
+                <w:color w:val="FFFFFF"/>
+                <w:sz w:val="20"/>
+                <w:szCs w:val="20"/>
+              </w:rPr>
+              <w:t xml:space="preserve">📸 Sección Responses de POST /api/v1/estudios desplegada, con los códigos que has documentado tú</w:t>
+            </w:r>
+          </w:p>
+        </w:tc>
+      </w:tr>
+      <w:tr>
+        <w:trPr>
+          <w:trHeight w:val="2400"/>
+        </w:trPr>
+        <w:tc>
+          <w:tcPr>
+            <w:tcW w:type="dxa" w:w="9638"/>
+            <w:tcBorders>
+              <w:top w:val="single" w:color="E0E0E0" w:sz="4"/>
+              <w:left w:val="single" w:color="E0E0E0" w:sz="4"/>
+              <w:bottom w:val="single" w:color="E0E0E0" w:sz="4"/>
+              <w:right w:val="single" w:color="E0E0E0" w:sz="4"/>
+            </w:tcBorders>
+            <w:shd w:fill="FAFAFA" w:val="clear"/>
+            <w:tcMar>
+              <w:top w:type="dxa" w:w="80"/>
+              <w:left w:type="dxa" w:w="160"/>
+              <w:bottom w:type="dxa" w:w="80"/>
+              <w:right w:type="dxa" w:w="160"/>
+            </w:tcMar>
+          </w:tcPr>
+          <w:p>
+            <w:pPr>
+              <w:jc w:val="center"/>
+            </w:pPr>
+            <w:r>
+              <w:rPr>
+                <w:rFonts w:ascii="Arial" w:cs="Arial" w:eastAsia="Arial" w:hAnsi="Arial"/>
+                <w:i/>
+                <w:iCs/>
+                <w:color w:val="757575"/>
+                <w:sz w:val="20"/>
+                <w:szCs w:val="20"/>
+              </w:rPr>
+              <w:t xml:space="preserve">[Pega aquí la captura de pantalla]</w:t>
+            </w:r>
+          </w:p>
+        </w:tc>
+      </w:tr>
+    </w:tbl>
+    <w:p>
+      <w:pPr>
+        <w:spacing w:after="160"/>
       </w:pPr>
     </w:p>
     <w:p>

</xml_diff>